<commit_message>
Add Screenshots for markdown linking
</commit_message>
<xml_diff>
--- a/Module 1/PT Labs/1.0.5-packet-tracer---logical-and-physical-mode-exploration.docx
+++ b/Module 1/PT Labs/1.0.5-packet-tracer---logical-and-physical-mode-exploration.docx
@@ -460,47 +460,6 @@
           <w:rFonts w:ascii="Courier New" w:hAnsi="Courier New" w:cs="Courier New"/>
         </w:rPr>
       </w:pPr>
-      <w:r>
-        <w:rPr>
-          <w:rFonts w:ascii="Courier New" w:hAnsi="Courier New" w:cs="Courier New"/>
-        </w:rPr>
-        <w:lastRenderedPageBreak/>
-        <w:drawing>
-          <wp:inline distT="0" distB="0" distL="0" distR="0" wp14:anchorId="68B7A8BC" wp14:editId="1CD32DBD">
-            <wp:extent cx="5865495" cy="3516630"/>
-            <wp:effectExtent l="0" t="0" r="1905" b="7620"/>
-            <wp:docPr id="220809147" name="Picture 1" descr="A computer on a table&#10;&#10;AI-generated content may be incorrect."/>
-            <wp:cNvGraphicFramePr>
-              <a:graphicFrameLocks xmlns:a="http://schemas.openxmlformats.org/drawingml/2006/main" noChangeAspect="1"/>
-            </wp:cNvGraphicFramePr>
-            <a:graphic xmlns:a="http://schemas.openxmlformats.org/drawingml/2006/main">
-              <a:graphicData uri="http://schemas.openxmlformats.org/drawingml/2006/picture">
-                <pic:pic xmlns:pic="http://schemas.openxmlformats.org/drawingml/2006/picture">
-                  <pic:nvPicPr>
-                    <pic:cNvPr id="220809147" name="Picture 1" descr="A computer on a table&#10;&#10;AI-generated content may be incorrect."/>
-                    <pic:cNvPicPr/>
-                  </pic:nvPicPr>
-                  <pic:blipFill>
-                    <a:blip r:embed="rId4"/>
-                    <a:stretch>
-                      <a:fillRect/>
-                    </a:stretch>
-                  </pic:blipFill>
-                  <pic:spPr>
-                    <a:xfrm>
-                      <a:off x="0" y="0"/>
-                      <a:ext cx="5865495" cy="3516630"/>
-                    </a:xfrm>
-                    <a:prstGeom prst="rect">
-                      <a:avLst/>
-                    </a:prstGeom>
-                  </pic:spPr>
-                </pic:pic>
-              </a:graphicData>
-            </a:graphic>
-          </wp:inline>
-        </w:drawing>
-      </w:r>
     </w:p>
     <w:p>
       <w:pPr>
@@ -535,46 +494,6 @@
           <w:rFonts w:ascii="Courier New" w:hAnsi="Courier New" w:cs="Courier New"/>
         </w:rPr>
       </w:pPr>
-      <w:r>
-        <w:rPr>
-          <w:rFonts w:ascii="Courier New" w:hAnsi="Courier New" w:cs="Courier New"/>
-        </w:rPr>
-        <w:drawing>
-          <wp:inline distT="0" distB="0" distL="0" distR="0" wp14:anchorId="40511E9D" wp14:editId="23C6792E">
-            <wp:extent cx="4925112" cy="2124371"/>
-            <wp:effectExtent l="0" t="0" r="8890" b="9525"/>
-            <wp:docPr id="2047355866" name="Picture 1" descr="A screenshot of a computer&#10;&#10;AI-generated content may be incorrect."/>
-            <wp:cNvGraphicFramePr>
-              <a:graphicFrameLocks xmlns:a="http://schemas.openxmlformats.org/drawingml/2006/main" noChangeAspect="1"/>
-            </wp:cNvGraphicFramePr>
-            <a:graphic xmlns:a="http://schemas.openxmlformats.org/drawingml/2006/main">
-              <a:graphicData uri="http://schemas.openxmlformats.org/drawingml/2006/picture">
-                <pic:pic xmlns:pic="http://schemas.openxmlformats.org/drawingml/2006/picture">
-                  <pic:nvPicPr>
-                    <pic:cNvPr id="2047355866" name="Picture 1" descr="A screenshot of a computer&#10;&#10;AI-generated content may be incorrect."/>
-                    <pic:cNvPicPr/>
-                  </pic:nvPicPr>
-                  <pic:blipFill>
-                    <a:blip r:embed="rId5"/>
-                    <a:stretch>
-                      <a:fillRect/>
-                    </a:stretch>
-                  </pic:blipFill>
-                  <pic:spPr>
-                    <a:xfrm>
-                      <a:off x="0" y="0"/>
-                      <a:ext cx="4925112" cy="2124371"/>
-                    </a:xfrm>
-                    <a:prstGeom prst="rect">
-                      <a:avLst/>
-                    </a:prstGeom>
-                  </pic:spPr>
-                </pic:pic>
-              </a:graphicData>
-            </a:graphic>
-          </wp:inline>
-        </w:drawing>
-      </w:r>
     </w:p>
     <w:p>
       <w:pPr>
@@ -1197,6 +1116,7 @@
   <w:style w:type="character" w:default="1" w:styleId="DefaultParagraphFont">
     <w:name w:val="Default Paragraph Font"/>
     <w:uiPriority w:val="1"/>
+    <w:semiHidden/>
     <w:unhideWhenUsed/>
   </w:style>
   <w:style w:type="table" w:default="1" w:styleId="TableNormal">

</xml_diff>